<commit_message>
Phase 2 defect fixes: PD II Exam 1
Course-mechanics questions removed (L1 15 -> 12, masters A/D/E 60 -> 59), lecturer citations removed, thin explanations rewritten, truncated master keys restored.
Each class chain was reviewed adversarially and repaired; site-wide 0 citations, 0 lecturer names, 0 answer-key mismatches, 0 console errors (287 pages).

Co-Authored-By: Claude Opus 5.5 (1M context) <noreply@anthropic.com>
</commit_message>
<xml_diff>
--- a/Physical Diagnosis 2 Exam 1/pd2-exam-1-study-guide.docx
+++ b/Physical Diagnosis 2 Exam 1/pd2-exam-1-study-guide.docx
@@ -17668,56 +17668,6 @@
           <w:i w:val="0"/>
         </w:rPr>
         <w:t>. All 43 figures are reproduced from the lecture slides and each is cited to the slide it came from.</w:t>
-      </w:r>
-    </w:p>
-    <w:p>
-      <w:pPr>
-        <w:spacing w:after="120"/>
-      </w:pPr>
-      <w:r>
-        <w:rPr>
-          <w:b w:val="0"/>
-          <w:i w:val="0"/>
-        </w:rPr>
-        <w:t>← Back to Homepage</w:t>
-      </w:r>
-    </w:p>
-    <w:p>
-      <w:pPr>
-        <w:spacing w:after="120"/>
-      </w:pPr>
-      <w:r>
-        <w:rPr>
-          <w:b w:val="0"/>
-          <w:i w:val="0"/>
-        </w:rPr>
-        <w:t>Built from your %s lecture decks for personal study · Class of 2028.</w:t>
-      </w:r>
-    </w:p>
-    <w:p>
-      <w:pPr>
-        <w:spacing w:after="120"/>
-      </w:pPr>
-      <w:r>
-        <w:rPr>
-          <w:b w:val="0"/>
-          <w:i w:val="0"/>
-        </w:rPr>
-        <w:t xml:space="preserve">★ </w:t>
-      </w:r>
-      <w:r>
-        <w:rPr>
-          <w:b w:val="0"/>
-          <w:i w:val="0"/>
-        </w:rPr>
-        <w:t>If you see any mistakes, click here to report it</w:t>
-      </w:r>
-      <w:r>
-        <w:rPr>
-          <w:b w:val="0"/>
-          <w:i w:val="0"/>
-        </w:rPr>
-        <w:t xml:space="preserve"> ★</w:t>
       </w:r>
     </w:p>
     <w:p>
@@ -34070,6 +34020,56 @@
           <w:i w:val="0"/>
         </w:rPr>
         <w:t xml:space="preserve"> (created by Megan B. Finck, MMS, PA-C; updated and presented by Rob Gray, DMSc, MMS, PA-C), Slides 1–95, and the lecture of 3 September 2026. Figures are reproduced from the lecture slides and each is cited to its slide.</w:t>
+      </w:r>
+    </w:p>
+    <w:p>
+      <w:pPr>
+        <w:spacing w:after="120"/>
+      </w:pPr>
+      <w:r>
+        <w:rPr>
+          <w:b w:val="0"/>
+          <w:i w:val="0"/>
+        </w:rPr>
+        <w:t>← Back to Homepage</w:t>
+      </w:r>
+    </w:p>
+    <w:p>
+      <w:pPr>
+        <w:spacing w:after="120"/>
+      </w:pPr>
+      <w:r>
+        <w:rPr>
+          <w:b w:val="0"/>
+          <w:i w:val="0"/>
+        </w:rPr>
+        <w:t>Built from your PAJ 5310 lecture decks for personal study · Class of 2028.</w:t>
+      </w:r>
+    </w:p>
+    <w:p>
+      <w:pPr>
+        <w:spacing w:after="120"/>
+      </w:pPr>
+      <w:r>
+        <w:rPr>
+          <w:b w:val="0"/>
+          <w:i w:val="0"/>
+        </w:rPr>
+        <w:t xml:space="preserve">★ </w:t>
+      </w:r>
+      <w:r>
+        <w:rPr>
+          <w:b w:val="0"/>
+          <w:i w:val="0"/>
+        </w:rPr>
+        <w:t>If you see any mistakes, click here to report it</w:t>
+      </w:r>
+      <w:r>
+        <w:rPr>
+          <w:b w:val="0"/>
+          <w:i w:val="0"/>
+        </w:rPr>
+        <w:t xml:space="preserve"> ★</w:t>
       </w:r>
     </w:p>
     <w:sectPr>

</xml_diff>